<commit_message>
Fix review: align JA FIGURES list with EN (5 entries), fix regex bug
- Remove fig3_hodge and fig8_alpha from JA FIGURES in generate_a2_docx.py
  (these figures belong to A1 only)
- Renumber JA captions: 図4→3, 図5→4, 図6→5
- Fix preprocess_latex regex in generate_all_docx.py: add negative lookahead
  to prevent \left/\right from corrupting \leftarrow/\rightarrow
- Regenerate A2 docx/pptx (now 5 slides)

Co-Authored-By: Tatsuki Onishi <bougtoir@gmail.com>
</commit_message>
<xml_diff>
--- a/spectral-causality-a2-ecd/manuscript_a2_ecd_ja.docx
+++ b/spectral-causality-a2-ecd/manuscript_a2_ecd_ja.docx
@@ -3748,14 +3748,6 @@
       </w:r>
     </w:p>
     <w:p>
-      <w:pPr>
-        <w:jc w:val="center"/>
-      </w:pPr>
-      <w:r>
-        <w:t>[Figure missing: fig3_hodge_decomposition.png]</w:t>
-      </w:r>
-    </w:p>
-    <w:p>
       <w:r/>
       <w:r>
         <w:rPr>
@@ -4892,14 +4884,6 @@
       </w:pPr>
       <w:r>
         <w:t>7.1 品質閾値</w:t>
-      </w:r>
-    </w:p>
-    <w:p>
-      <w:pPr>
-        <w:jc w:val="center"/>
-      </w:pPr>
-      <w:r>
-        <w:t>[Figure missing: fig8_alpha_sweep.png]</w:t>
       </w:r>
     </w:p>
     <w:p>

</xml_diff>

<commit_message>
Fix JA figure numbering: 図4,5,6 -> 図3,4,5 to match EN
Co-Authored-By: Tatsuki Onishi <bougtoir@gmail.com>
</commit_message>
<xml_diff>
--- a/spectral-causality-a2-ecd/manuscript_a2_ecd_ja.docx
+++ b/spectral-causality-a2-ecd/manuscript_a2_ecd_ja.docx
@@ -4134,7 +4134,7 @@
           <w:i/>
           <w:sz w:val="18"/>
         </w:rPr>
-        <w:t>図4. 3手法による因果方向比較。全辺ペアでの一致・不一致。</w:t>
+        <w:t>図3. 3手法による因果方向比較。全辺ペアでの一致・不一致。</w:t>
       </w:r>
     </w:p>
     <w:p>
@@ -4725,7 +4725,7 @@
           <w:i/>
           <w:sz w:val="18"/>
         </w:rPr>
-        <w:t>図5. LiNGAM DAG（左）vs スペクトル因果性DCG（右）。破線：フィードバック辺。</w:t>
+        <w:t>図4. LiNGAM DAG（左）vs スペクトル因果性DCG（右）。破線：フィードバック辺。</w:t>
       </w:r>
     </w:p>
     <w:p>
@@ -5986,7 +5986,7 @@
           <w:i/>
           <w:sz w:val="18"/>
         </w:rPr>
-        <w:t>図6. ECDアンサンブル・プルーニング解析。辺レベルフィードバック率。</w:t>
+        <w:t>図5. ECDアンサンブル・プルーニング解析。辺レベルフィードバック率。</w:t>
       </w:r>
     </w:p>
     <w:tbl>

</xml_diff>